<commit_message>
docs: regenerate technical design doc with 1-hour access TTL
Updated text (8 spots), diagrams (login flow, token check, identity ERD),
and the rendered .docx to reflect the 1h access / 30d refresh decision.

Co-Authored-By: Claude Opus 4.7 (1M context) <noreply@anthropic.com>
</commit_message>
<xml_diff>
--- a/docs/technical/auth-server-technical-design.docx
+++ b/docs/technical/auth-server-technical-design.docx
@@ -3014,7 +3014,7 @@
         <w:spacing w:after="120"/>
       </w:pPr>
       <w:r>
-        <w:t xml:space="preserve">On each protected request, the application verifies the JWT signature against Casdoor's JWKS (cached locally), checks expiry, and evaluates the subscription claims offline. When the short-lived access token expires, the app silently exchanges its refresh token for a new access token carrying fresh claims. The user stays signed in for the refresh-token lifetime (30 days) while subscription state is refreshed at most every access-token lifetime (15 minutes).</w:t>
+        <w:t xml:space="preserve">On each protected request, the application verifies the JWT signature against Casdoor's JWKS (cached locally), checks expiry, and evaluates the subscription claims offline. When the short-lived access token expires, the app silently exchanges its refresh token for a new access token carrying fresh claims. The user stays signed in for the refresh-token lifetime (30 days) while subscription state is refreshed at most every access-token lifetime (1 hour).</w:t>
       </w:r>
     </w:p>
     <w:p>
@@ -3084,7 +3084,7 @@
         <w:spacing w:after="120"/>
       </w:pPr>
       <w:r>
-        <w:t xml:space="preserve">Accepted trade-off: a user whose subscription expires or is cancelled mid-token retains access for up to the 15-minute access-token TTL. This is the cost of offline verification; an online check can be added at specific sensitive actions later if instant revocation is required.</w:t>
+        <w:t xml:space="preserve">Accepted trade-off: a user whose subscription expires or is cancelled mid-token retains access for up to the 1-hour access-token TTL. This is the cost of offline verification; an online check can be added at specific sensitive actions later if instant revocation is required.</w:t>
       </w:r>
     </w:p>
     <w:p>
@@ -4091,7 +4091,7 @@
                 <w:sz w:val="19"/>
                 <w:szCs w:val="19"/>
               </w:rPr>
-              <w:t xml:space="preserve">int (min)</w:t>
+              <w:t xml:space="preserve">int (hours)</w:t>
             </w:r>
           </w:p>
         </w:tc>
@@ -4122,7 +4122,7 @@
                 <w:sz w:val="19"/>
                 <w:szCs w:val="19"/>
               </w:rPr>
-              <w:t xml:space="preserve">15 minutes</w:t>
+              <w:t xml:space="preserve">1 hour (expireInHours)</w:t>
             </w:r>
           </w:p>
         </w:tc>
@@ -6839,7 +6839,7 @@
                 <w:sz w:val="19"/>
                 <w:szCs w:val="19"/>
               </w:rPr>
-              <w:t xml:space="preserve">Issued-at / expiry (15 min after iat)</w:t>
+              <w:t xml:space="preserve">Issued-at / expiry (1 hour after iat)</w:t>
             </w:r>
           </w:p>
         </w:tc>
@@ -7848,7 +7848,7 @@
                 <w:sz w:val="19"/>
                 <w:szCs w:val="19"/>
               </w:rPr>
-              <w:t xml:space="preserve">Offline JWT verification accepts staleness bounded by the 15-minute access-token TTL by design (see 5.2).</w:t>
+              <w:t xml:space="preserve">Offline JWT verification accepts staleness bounded by the 1-hour access-token TTL by design (see 5.2).</w:t>
             </w:r>
           </w:p>
         </w:tc>
@@ -8120,7 +8120,7 @@
                 <w:sz w:val="19"/>
                 <w:szCs w:val="19"/>
               </w:rPr>
-              <w:t xml:space="preserve">Short 15-min access TTL; RS256 signature verification; TLS everywhere</w:t>
+              <w:t xml:space="preserve">Short 1-hour access TTL; RS256 signature verification; TLS everywhere</w:t>
             </w:r>
           </w:p>
         </w:tc>
@@ -9002,7 +9002,7 @@
                 <w:sz w:val="19"/>
                 <w:szCs w:val="19"/>
               </w:rPr>
-              <w:t xml:space="preserve">Bounded 15-min staleness; online check for sensitive actions if needed</w:t>
+              <w:t xml:space="preserve">Bounded 1-hour staleness; online check for sensitive actions if needed</w:t>
             </w:r>
           </w:p>
         </w:tc>
@@ -10497,7 +10497,7 @@
                 <w:sz w:val="19"/>
                 <w:szCs w:val="19"/>
               </w:rPr>
-              <w:t xml:space="preserve">15 minutes</w:t>
+              <w:t xml:space="preserve">1 hour</w:t>
             </w:r>
           </w:p>
         </w:tc>

</xml_diff>

<commit_message>
docs: update design spec + technical doc for nested 'properties' claim shape
Reflects the live-verified Casdoor behavior: JWT-Custom token fields select
User struct fields, so subscription data is emitted as a nested 'properties'
claim. Updated the spec's Token & Subscription Model, the .docx JWT claims
table, the APPLICATION tokenFields row, and the app-side gate description.

Co-Authored-By: Claude Opus 4.7 (1M context) <noreply@anthropic.com>
</commit_message>
<xml_diff>
--- a/docs/technical/auth-server-technical-design.docx
+++ b/docs/technical/auth-server-technical-design.docx
@@ -4027,7 +4027,7 @@
                 <w:sz w:val="19"/>
                 <w:szCs w:val="19"/>
               </w:rPr>
-              <w:t xml:space="preserve">Custom claims: plan, role, subscriptionStatus, subscriptionEndTime</w:t>
+              <w:t xml:space="preserve">[Id, Name, DisplayName, Properties] -&gt; subscription data emitted as nested 'properties' claim</w:t>
             </w:r>
           </w:p>
         </w:tc>
@@ -6872,7 +6872,7 @@
                 <w:sz w:val="19"/>
                 <w:szCs w:val="19"/>
               </w:rPr>
-              <w:t xml:space="preserve">plan</w:t>
+              <w:t xml:space="preserve">properties.plan</w:t>
             </w:r>
           </w:p>
         </w:tc>
@@ -6967,7 +6967,7 @@
                 <w:sz w:val="19"/>
                 <w:szCs w:val="19"/>
               </w:rPr>
-              <w:t xml:space="preserve">role</w:t>
+              <w:t xml:space="preserve">properties.role</w:t>
             </w:r>
           </w:p>
         </w:tc>
@@ -7062,7 +7062,7 @@
                 <w:sz w:val="19"/>
                 <w:szCs w:val="19"/>
               </w:rPr>
-              <w:t xml:space="preserve">subscriptionStatus</w:t>
+              <w:t xml:space="preserve">properties.subscriptionStatus</w:t>
             </w:r>
           </w:p>
         </w:tc>
@@ -7157,7 +7157,7 @@
                 <w:sz w:val="19"/>
                 <w:szCs w:val="19"/>
               </w:rPr>
-              <w:t xml:space="preserve">subscriptionEndTime</w:t>
+              <w:t xml:space="preserve">properties.subscriptionEndTime</w:t>
             </w:r>
           </w:p>
         </w:tc>
@@ -7219,7 +7219,7 @@
                 <w:sz w:val="19"/>
                 <w:szCs w:val="19"/>
               </w:rPr>
-              <w:t xml:space="preserve">Expiry used for offline check</w:t>
+              <w:t xml:space="preserve">Expiry used for offline check (RFC3339)</w:t>
             </w:r>
           </w:p>
         </w:tc>
@@ -7230,11 +7230,19 @@
         <w:spacing w:after="120"/>
       </w:pPr>
       <w:r>
+        <w:t xml:space="preserve">Casdoor's JWT-Custom token fields select User struct fields, not arbitrary keys (verified on v1.812.0). The subscription data lives in the user's Properties and is emitted as a single nested "properties" claim by setting token fields to [Id, Name, DisplayName, Properties].</w:t>
+      </w:r>
+    </w:p>
+    <w:p>
+      <w:pPr>
+        <w:spacing w:after="120"/>
+      </w:pPr>
+      <w:r>
         <w:rPr>
           <w:b/>
           <w:bCs/>
         </w:rPr>
-        <w:t xml:space="preserve">App-side gate: verify signature against JWKS, then require subscriptionStatus == "Active" AND now &lt; subscriptionEndTime.</w:t>
+        <w:t xml:space="preserve">App-side gate: verify signature against the public key, then require properties.subscriptionStatus == "Active" AND now &lt; properties.subscriptionEndTime.</w:t>
       </w:r>
     </w:p>
     <w:p>

</xml_diff>